<commit_message>
checkpoint before checking out main
</commit_message>
<xml_diff>
--- a/frontend/e2e/fixtures/demo-retail-letterhead-seed.docx
+++ b/frontend/e2e/fixtures/demo-retail-letterhead-seed.docx
@@ -20,6 +20,15 @@
       <w:r>
         <w:rPr>
           <w:rFonts w:ascii="Calibri" w:hAnsi="Calibri" w:cs="Calibri" w:eastAsia="Calibri"/>
+          <w:sz w:val="20"/>
+        </w:rPr>
+        <w:t>Meridian Everyday Current Account — correspondence confirmation</w:t>
+      </w:r>
+    </w:p>
+    <w:p>
+      <w:r>
+        <w:rPr>
+          <w:rFonts w:ascii="Calibri" w:hAnsi="Calibri" w:cs="Calibri" w:eastAsia="Calibri"/>
         </w:rPr>
         <w:t>Dear {{anchor:HEADER}} customer</w:t>
       </w:r>

</xml_diff>